<commit_message>
feat(nfe): modernizacao dos detalhes da venda e impressao do orcamento de venda
</commit_message>
<xml_diff>
--- a/docs/🧠 Como funciona o Lucro Real na prática.docx
+++ b/docs/🧠 Como funciona o Lucro Real na prática.docx
@@ -26,7 +26,7 @@
     <w:p>
       <w:r>
         <w:pict w14:anchorId="11E83A08">
-          <v:rect id="_x0000_i1049" style="width:631.05pt;height:.75pt" o:hrpct="0" o:hralign="center" o:hrstd="t" o:hr="t" fillcolor="#a0a0a0" stroked="f"/>
+          <v:rect id="_x0000_i1025" style="width:631.05pt;height:.75pt" o:hrpct="0" o:hralign="center" o:hrstd="t" o:hr="t" fillcolor="#a0a0a0" stroked="f"/>
         </w:pict>
       </w:r>
     </w:p>
@@ -120,7 +120,7 @@
     <w:p>
       <w:r>
         <w:pict w14:anchorId="1506F2C4">
-          <v:rect id="_x0000_i1050" style="width:631.05pt;height:.75pt" o:hrpct="0" o:hralign="center" o:hrstd="t" o:hr="t" fillcolor="#a0a0a0" stroked="f"/>
+          <v:rect id="_x0000_i1026" style="width:631.05pt;height:.75pt" o:hrpct="0" o:hralign="center" o:hrstd="t" o:hr="t" fillcolor="#a0a0a0" stroked="f"/>
         </w:pict>
       </w:r>
     </w:p>
@@ -583,7 +583,7 @@
     <w:p>
       <w:r>
         <w:pict w14:anchorId="469C02F9">
-          <v:rect id="_x0000_i1051" style="width:631.05pt;height:.75pt" o:hrpct="0" o:hralign="center" o:hrstd="t" o:hr="t" fillcolor="#a0a0a0" stroked="f"/>
+          <v:rect id="_x0000_i1027" style="width:631.05pt;height:.75pt" o:hrpct="0" o:hralign="center" o:hrstd="t" o:hr="t" fillcolor="#a0a0a0" stroked="f"/>
         </w:pict>
       </w:r>
     </w:p>
@@ -679,7 +679,7 @@
     <w:p>
       <w:r>
         <w:pict w14:anchorId="6A2AE604">
-          <v:rect id="_x0000_i1052" style="width:631.05pt;height:.75pt" o:hrpct="0" o:hralign="center" o:hrstd="t" o:hr="t" fillcolor="#a0a0a0" stroked="f"/>
+          <v:rect id="_x0000_i1028" style="width:631.05pt;height:.75pt" o:hrpct="0" o:hralign="center" o:hrstd="t" o:hr="t" fillcolor="#a0a0a0" stroked="f"/>
         </w:pict>
       </w:r>
     </w:p>
@@ -746,7 +746,7 @@
     <w:p>
       <w:r>
         <w:pict w14:anchorId="334D1D67">
-          <v:rect id="_x0000_i1093" style="width:631.05pt;height:.75pt" o:hrpct="0" o:hralign="center" o:hrstd="t" o:hr="t" fillcolor="#a0a0a0" stroked="f"/>
+          <v:rect id="_x0000_i1029" style="width:631.05pt;height:.75pt" o:hrpct="0" o:hralign="center" o:hrstd="t" o:hr="t" fillcolor="#a0a0a0" stroked="f"/>
         </w:pict>
       </w:r>
     </w:p>
@@ -861,7 +861,7 @@
     <w:p>
       <w:r>
         <w:pict w14:anchorId="306DD242">
-          <v:rect id="_x0000_i1094" style="width:631.05pt;height:.75pt" o:hrpct="0" o:hralign="center" o:hrstd="t" o:hr="t" fillcolor="#a0a0a0" stroked="f"/>
+          <v:rect id="_x0000_i1030" style="width:631.05pt;height:.75pt" o:hrpct="0" o:hralign="center" o:hrstd="t" o:hr="t" fillcolor="#a0a0a0" stroked="f"/>
         </w:pict>
       </w:r>
     </w:p>
@@ -984,7 +984,7 @@
     <w:p>
       <w:r>
         <w:pict w14:anchorId="0027FFA7">
-          <v:rect id="_x0000_i1095" style="width:631.05pt;height:.75pt" o:hrpct="0" o:hralign="center" o:hrstd="t" o:hr="t" fillcolor="#a0a0a0" stroked="f"/>
+          <v:rect id="_x0000_i1031" style="width:631.05pt;height:.75pt" o:hrpct="0" o:hralign="center" o:hrstd="t" o:hr="t" fillcolor="#a0a0a0" stroked="f"/>
         </w:pict>
       </w:r>
     </w:p>
@@ -1043,7 +1043,7 @@
     <w:p>
       <w:r>
         <w:pict w14:anchorId="19875CB2">
-          <v:rect id="_x0000_i1096" style="width:631.05pt;height:.75pt" o:hrpct="0" o:hralign="center" o:hrstd="t" o:hr="t" fillcolor="#a0a0a0" stroked="f"/>
+          <v:rect id="_x0000_i1032" style="width:631.05pt;height:.75pt" o:hrpct="0" o:hralign="center" o:hrstd="t" o:hr="t" fillcolor="#a0a0a0" stroked="f"/>
         </w:pict>
       </w:r>
     </w:p>
@@ -1099,7 +1099,7 @@
     <w:p>
       <w:r>
         <w:pict w14:anchorId="78FBE6E3">
-          <v:rect id="_x0000_i1097" style="width:631.05pt;height:.75pt" o:hrpct="0" o:hralign="center" o:hrstd="t" o:hr="t" fillcolor="#a0a0a0" stroked="f"/>
+          <v:rect id="_x0000_i1033" style="width:631.05pt;height:.75pt" o:hrpct="0" o:hralign="center" o:hrstd="t" o:hr="t" fillcolor="#a0a0a0" stroked="f"/>
         </w:pict>
       </w:r>
     </w:p>
@@ -1158,7 +1158,7 @@
     <w:p>
       <w:r>
         <w:pict w14:anchorId="72D592F2">
-          <v:rect id="_x0000_i1098" style="width:631.05pt;height:.75pt" o:hrpct="0" o:hralign="center" o:hrstd="t" o:hr="t" fillcolor="#a0a0a0" stroked="f"/>
+          <v:rect id="_x0000_i1034" style="width:631.05pt;height:.75pt" o:hrpct="0" o:hralign="center" o:hrstd="t" o:hr="t" fillcolor="#a0a0a0" stroked="f"/>
         </w:pict>
       </w:r>
     </w:p>
@@ -1207,6 +1207,719 @@
       </w:r>
       <w:r>
         <w:t>. O seu papel como fornecedor de software é fornecer a ferramenta configurada exatamente com as orientações contábeis que eles fornecerem.</w:t>
+      </w:r>
+    </w:p>
+    <w:p/>
+    <w:p>
+      <w:pPr>
+        <w:pBdr>
+          <w:bottom w:val="single" w:sz="6" w:space="1" w:color="auto"/>
+        </w:pBdr>
+      </w:pPr>
+    </w:p>
+    <w:p/>
+    <w:p>
+      <w:r>
+        <w:t>Sim! Saber o segmento dos produtos (</w:t>
+      </w:r>
+      <w:r>
+        <w:rPr>
+          <w:b/>
+          <w:bCs/>
+        </w:rPr>
+        <w:t>Material de Limpeza, Material Escolar e Cama, Mesa e Banho</w:t>
+      </w:r>
+      <w:r>
+        <w:t>) e que a emissão será </w:t>
+      </w:r>
+      <w:r>
+        <w:rPr>
+          <w:b/>
+          <w:bCs/>
+        </w:rPr>
+        <w:t>exclusivamente NF-e (Modelo 55)</w:t>
+      </w:r>
+      <w:r>
+        <w:t> muda alguns detalhes muito importantes na prática fiscal.</w:t>
+      </w:r>
+    </w:p>
+    <w:p>
+      <w:r>
+        <w:t xml:space="preserve">Abaixo </w:t>
+      </w:r>
+      <w:proofErr w:type="spellStart"/>
+      <w:r>
+        <w:t>explico</w:t>
+      </w:r>
+      <w:proofErr w:type="spellEnd"/>
+      <w:r>
+        <w:t xml:space="preserve"> exatamente o que muda e, em seguida, deixo o novo modelo de mensagem pronto para o contador.</w:t>
+      </w:r>
+    </w:p>
+    <w:p>
+      <w:r>
+        <w:pict w14:anchorId="49333582">
+          <v:rect id="_x0000_i1053" style="width:568.05pt;height:.75pt" o:hrpct="0" o:hralign="center" o:hrstd="t" o:hr="t" fillcolor="#a0a0a0" stroked="f"/>
+        </w:pict>
+      </w:r>
+    </w:p>
+    <w:p>
+      <w:r>
+        <w:rPr>
+          <w:rFonts w:ascii="Segoe UI Emoji" w:hAnsi="Segoe UI Emoji" w:cs="Segoe UI Emoji"/>
+        </w:rPr>
+        <w:t>🔍</w:t>
+      </w:r>
+      <w:r>
+        <w:t xml:space="preserve"> O que muda com esses produtos e com a emissão exclusiva de NF-e?</w:t>
+      </w:r>
+    </w:p>
+    <w:p>
+      <w:r>
+        <w:t>1. IPI Simplificado (Praticamente Zero Dor de Cabeça)</w:t>
+      </w:r>
+    </w:p>
+    <w:p>
+      <w:r>
+        <w:t>Como o seu cliente é um comércio que revende produtos prontos (não é fábrica/indústria):</w:t>
+      </w:r>
+    </w:p>
+    <w:p>
+      <w:pPr>
+        <w:numPr>
+          <w:ilvl w:val="0"/>
+          <w:numId w:val="9"/>
+        </w:numPr>
+      </w:pPr>
+      <w:r>
+        <w:rPr>
+          <w:b/>
+          <w:bCs/>
+        </w:rPr>
+        <w:t>Não haverá destaque de IPI nas vendas.</w:t>
+      </w:r>
+    </w:p>
+    <w:p>
+      <w:pPr>
+        <w:numPr>
+          <w:ilvl w:val="0"/>
+          <w:numId w:val="9"/>
+        </w:numPr>
+      </w:pPr>
+      <w:r>
+        <w:t>O CST de IPI padrão será </w:t>
+      </w:r>
+      <w:r>
+        <w:rPr>
+          <w:b/>
+          <w:bCs/>
+        </w:rPr>
+        <w:t>53 (Não tributada)</w:t>
+      </w:r>
+      <w:r>
+        <w:t> ou sem incidência de IPI.</w:t>
+      </w:r>
+    </w:p>
+    <w:p>
+      <w:r>
+        <w:t>2. O Ponto Crucial: ICMS Normal (CST 00) vs. ICMS-ST (CST 60)</w:t>
+      </w:r>
+    </w:p>
+    <w:p>
+      <w:r>
+        <w:t>No segmento de </w:t>
+      </w:r>
+      <w:r>
+        <w:rPr>
+          <w:b/>
+          <w:bCs/>
+        </w:rPr>
+        <w:t>material de limpeza</w:t>
+      </w:r>
+      <w:r>
+        <w:t> e alguns itens de </w:t>
+      </w:r>
+      <w:r>
+        <w:rPr>
+          <w:b/>
+          <w:bCs/>
+        </w:rPr>
+        <w:t>papelaria/material escolar</w:t>
+      </w:r>
+      <w:r>
+        <w:t>, é muito comum haver </w:t>
+      </w:r>
+      <w:r>
+        <w:rPr>
+          <w:b/>
+          <w:bCs/>
+        </w:rPr>
+        <w:t>Substituição Tributária (ICMS-ST)</w:t>
+      </w:r>
+      <w:r>
+        <w:t> dependendo do seu Estado:</w:t>
+      </w:r>
+    </w:p>
+    <w:p>
+      <w:pPr>
+        <w:numPr>
+          <w:ilvl w:val="0"/>
+          <w:numId w:val="10"/>
+        </w:numPr>
+      </w:pPr>
+      <w:r>
+        <w:rPr>
+          <w:b/>
+          <w:bCs/>
+        </w:rPr>
+        <w:lastRenderedPageBreak/>
+        <w:t>Produtos comuns (</w:t>
+      </w:r>
+      <w:proofErr w:type="spellStart"/>
+      <w:r>
+        <w:rPr>
+          <w:b/>
+          <w:bCs/>
+        </w:rPr>
+        <w:t>ex</w:t>
+      </w:r>
+      <w:proofErr w:type="spellEnd"/>
+      <w:r>
+        <w:rPr>
+          <w:b/>
+          <w:bCs/>
+        </w:rPr>
+        <w:t>: lençol, toalha, cadernos comuns):</w:t>
+      </w:r>
+      <w:r>
+        <w:t> Venda tributada normal (</w:t>
+      </w:r>
+      <w:r>
+        <w:rPr>
+          <w:b/>
+          <w:bCs/>
+        </w:rPr>
+        <w:t>CST 00</w:t>
+      </w:r>
+      <w:r>
+        <w:t> e CFOP </w:t>
+      </w:r>
+      <w:r>
+        <w:rPr>
+          <w:b/>
+          <w:bCs/>
+        </w:rPr>
+        <w:t>5.102</w:t>
+      </w:r>
+      <w:r>
+        <w:t>).</w:t>
+      </w:r>
+    </w:p>
+    <w:p>
+      <w:pPr>
+        <w:numPr>
+          <w:ilvl w:val="0"/>
+          <w:numId w:val="10"/>
+        </w:numPr>
+      </w:pPr>
+      <w:r>
+        <w:rPr>
+          <w:b/>
+          <w:bCs/>
+        </w:rPr>
+        <w:t>Produtos com Substituição Tributária (</w:t>
+      </w:r>
+      <w:proofErr w:type="spellStart"/>
+      <w:r>
+        <w:rPr>
+          <w:b/>
+          <w:bCs/>
+        </w:rPr>
+        <w:t>ex</w:t>
+      </w:r>
+      <w:proofErr w:type="spellEnd"/>
+      <w:r>
+        <w:rPr>
+          <w:b/>
+          <w:bCs/>
+        </w:rPr>
+        <w:t>: certos desinfetantes, detergentes, químicos de limpeza):</w:t>
+      </w:r>
+      <w:r>
+        <w:t> O imposto já foi pago antecipadamente na indústria/distribuidor. A venda sai com </w:t>
+      </w:r>
+      <w:r>
+        <w:rPr>
+          <w:b/>
+          <w:bCs/>
+        </w:rPr>
+        <w:t>CST 60</w:t>
+      </w:r>
+      <w:r>
+        <w:t> e CFOP </w:t>
+      </w:r>
+      <w:r>
+        <w:rPr>
+          <w:b/>
+          <w:bCs/>
+        </w:rPr>
+        <w:t>5.405</w:t>
+      </w:r>
+      <w:r>
+        <w:t> (o que evita pagar ICMS duas vezes!).</w:t>
+      </w:r>
+    </w:p>
+    <w:p>
+      <w:pPr>
+        <w:numPr>
+          <w:ilvl w:val="0"/>
+          <w:numId w:val="10"/>
+        </w:numPr>
+      </w:pPr>
+      <w:r>
+        <w:t>Por isso, o contador só precisa indicar quais desses produtos são </w:t>
+      </w:r>
+      <w:r>
+        <w:rPr>
+          <w:b/>
+          <w:bCs/>
+        </w:rPr>
+        <w:t>Tributados Normais (CST 00 / CFOP 5102)</w:t>
+      </w:r>
+      <w:r>
+        <w:t> e quais são </w:t>
+      </w:r>
+      <w:r>
+        <w:rPr>
+          <w:b/>
+          <w:bCs/>
+        </w:rPr>
+        <w:t>ST (CST 60 / CFOP 5405)</w:t>
+      </w:r>
+      <w:r>
+        <w:t>.</w:t>
+      </w:r>
+    </w:p>
+    <w:p>
+      <w:r>
+        <w:t>3. PIS e COFINS no Lucro Real (Regime Geral)</w:t>
+      </w:r>
+    </w:p>
+    <w:p>
+      <w:pPr>
+        <w:numPr>
+          <w:ilvl w:val="0"/>
+          <w:numId w:val="11"/>
+        </w:numPr>
+      </w:pPr>
+      <w:r>
+        <w:rPr>
+          <w:b/>
+          <w:bCs/>
+        </w:rPr>
+        <w:t>PIS:</w:t>
+      </w:r>
+      <w:r>
+        <w:t> 1,65% (CST 01)</w:t>
+      </w:r>
+    </w:p>
+    <w:p>
+      <w:pPr>
+        <w:numPr>
+          <w:ilvl w:val="0"/>
+          <w:numId w:val="11"/>
+        </w:numPr>
+      </w:pPr>
+      <w:r>
+        <w:rPr>
+          <w:b/>
+          <w:bCs/>
+        </w:rPr>
+        <w:t>COFINS:</w:t>
+      </w:r>
+      <w:r>
+        <w:t> 7,60% (CST 01)</w:t>
+      </w:r>
+    </w:p>
+    <w:p>
+      <w:pPr>
+        <w:numPr>
+          <w:ilvl w:val="0"/>
+          <w:numId w:val="11"/>
+        </w:numPr>
+      </w:pPr>
+      <w:r>
+        <w:rPr>
+          <w:i/>
+          <w:iCs/>
+        </w:rPr>
+        <w:t>Observação:</w:t>
+      </w:r>
+      <w:r>
+        <w:t> Se houver algum item de higiene/limpeza enquadrado como monofásico, o contador indicará CST 04.</w:t>
+      </w:r>
+    </w:p>
+    <w:p>
+      <w:r>
+        <w:t>4. Foco 100% em NF-e (Modelo 55)</w:t>
+      </w:r>
+    </w:p>
+    <w:p>
+      <w:pPr>
+        <w:numPr>
+          <w:ilvl w:val="0"/>
+          <w:numId w:val="12"/>
+        </w:numPr>
+      </w:pPr>
+      <w:r>
+        <w:t>Não será necessário configurar tokens de NFC-e (CSC) nem cupom fiscal neste primeiro momento. O foco total será na emissão da NF-e padrão.</w:t>
+      </w:r>
+    </w:p>
+    <w:p>
+      <w:r>
+        <w:pict w14:anchorId="4C989D55">
+          <v:rect id="_x0000_i1054" style="width:568.05pt;height:.75pt" o:hrpct="0" o:hralign="center" o:hrstd="t" o:hr="t" fillcolor="#a0a0a0" stroked="f"/>
+        </w:pict>
+      </w:r>
+    </w:p>
+    <w:p>
+      <w:r>
+        <w:rPr>
+          <w:rFonts w:ascii="Segoe UI Emoji" w:hAnsi="Segoe UI Emoji" w:cs="Segoe UI Emoji"/>
+        </w:rPr>
+        <w:t>📩</w:t>
+      </w:r>
+      <w:r>
+        <w:t xml:space="preserve"> Novo Modelo de Mensagem Adaptado para o Contador (Copiar e Colar)</w:t>
+      </w:r>
+    </w:p>
+    <w:p>
+      <w:r>
+        <w:t>Copie e envie o texto abaixo para a contabilidade do cliente:</w:t>
+      </w:r>
+    </w:p>
+    <w:p>
+      <w:proofErr w:type="spellStart"/>
+      <w:r>
+        <w:t>text</w:t>
+      </w:r>
+      <w:proofErr w:type="spellEnd"/>
+    </w:p>
+    <w:p>
+      <w:r>
+        <w:t>Olá, tudo bem?</w:t>
+      </w:r>
+    </w:p>
+    <w:p>
+      <w:r>
+        <w:t>Estamos realizando a implantação e parametrização fiscal no ERP para a empresa [NOME DA EMPRESA], que é do regime LUCRO REAL (CRT 3).</w:t>
+      </w:r>
+    </w:p>
+    <w:p>
+      <w:r>
+        <w:t>Neste primeiro momento, a empresa realizará operações de revenda no comércio com emissão EXCLUSIVAMENTE de NF-e (Modelo 55), trabalhando com as seguintes linhas de produtos:</w:t>
+      </w:r>
+    </w:p>
+    <w:p>
+      <w:r>
+        <w:t>- Materiais de Limpeza;</w:t>
+      </w:r>
+    </w:p>
+    <w:p>
+      <w:r>
+        <w:t>- Materiais Escolares / Papelaria;</w:t>
+      </w:r>
+    </w:p>
+    <w:p>
+      <w:r>
+        <w:t>- Cama, Mesa e Banho.</w:t>
+      </w:r>
+    </w:p>
+    <w:p>
+      <w:r>
+        <w:t>Para que a equipe emita as NF-e sem erros, criamos um acesso direto para o setor fiscal no ERP:</w:t>
+      </w:r>
+    </w:p>
+    <w:p>
+      <w:r>
+        <w:rPr>
+          <w:rFonts w:ascii="Segoe UI Emoji" w:hAnsi="Segoe UI Emoji" w:cs="Segoe UI Emoji"/>
+        </w:rPr>
+        <w:lastRenderedPageBreak/>
+        <w:t>🔗</w:t>
+      </w:r>
+      <w:r>
+        <w:t xml:space="preserve"> Link: [SEU_LINK_DO_SISTEMA]</w:t>
+      </w:r>
+    </w:p>
+    <w:p>
+      <w:r>
+        <w:rPr>
+          <w:rFonts w:ascii="Segoe UI Emoji" w:hAnsi="Segoe UI Emoji" w:cs="Segoe UI Emoji"/>
+        </w:rPr>
+        <w:t>👤</w:t>
+      </w:r>
+      <w:r>
+        <w:t xml:space="preserve"> Usuário: [EMAIL_OU_LOGIN]</w:t>
+      </w:r>
+    </w:p>
+    <w:p>
+      <w:r>
+        <w:rPr>
+          <w:rFonts w:ascii="Segoe UI Emoji" w:hAnsi="Segoe UI Emoji" w:cs="Segoe UI Emoji"/>
+        </w:rPr>
+        <w:t>🔑</w:t>
+      </w:r>
+      <w:r>
+        <w:t xml:space="preserve"> Senha: [SENHA_PROVISORIA]</w:t>
+      </w:r>
+    </w:p>
+    <w:p>
+      <w:r>
+        <w:t>Vocês podem cadastrar as regras no menu "Naturezas de Operação" ou nos retornar com os parâmetros abaixo para cadastrarmos:</w:t>
+      </w:r>
+    </w:p>
+    <w:p>
+      <w:r>
+        <w:t>1. CFOP e ICMS para Vendas Internas (Dentro do Estado):</w:t>
+      </w:r>
+    </w:p>
+    <w:p>
+      <w:r>
+        <w:t xml:space="preserve">   - Mercadorias tributadas integralmente (</w:t>
+      </w:r>
+      <w:proofErr w:type="spellStart"/>
+      <w:r>
+        <w:t>Ex</w:t>
+      </w:r>
+      <w:proofErr w:type="spellEnd"/>
+      <w:r>
+        <w:t>: Cama, mesa e banho / escolares):</w:t>
+      </w:r>
+    </w:p>
+    <w:p>
+      <w:r>
+        <w:t xml:space="preserve">     CFOP: _____ (Padrão: 5.102) | CST ICMS: _____ (Padrão: 00) | Alíquota ICMS: _____ %</w:t>
+      </w:r>
+    </w:p>
+    <w:p>
+      <w:r>
+        <w:t xml:space="preserve">   - Mercadorias com Substituição Tributária - ST (</w:t>
+      </w:r>
+      <w:proofErr w:type="spellStart"/>
+      <w:r>
+        <w:t>Ex</w:t>
+      </w:r>
+      <w:proofErr w:type="spellEnd"/>
+      <w:r>
+        <w:t>: certos produtos de limpeza):</w:t>
+      </w:r>
+    </w:p>
+    <w:p>
+      <w:r>
+        <w:t xml:space="preserve">     CFOP: _____ (Padrão: 5.405) | CST ICMS: _____ (Padrão: 60)</w:t>
+      </w:r>
+    </w:p>
+    <w:p>
+      <w:r>
+        <w:t>2. Vendas Interestaduais (Fora do Estado):</w:t>
+      </w:r>
+    </w:p>
+    <w:p>
+      <w:r>
+        <w:t xml:space="preserve">   - CFOP Interestadual comum: _____ (Padrão: 6.102)</w:t>
+      </w:r>
+    </w:p>
+    <w:p>
+      <w:r>
+        <w:t xml:space="preserve">   - CFOP Interestadual com ST: _____ (Padrão: 6.403 / 6.404)</w:t>
+      </w:r>
+    </w:p>
+    <w:p>
+      <w:r>
+        <w:t>3. Devoluções:</w:t>
+      </w:r>
+    </w:p>
+    <w:p>
+      <w:r>
+        <w:t xml:space="preserve">   - Devolução de compra a fornecedor: _____ (Padrão: 5.202 estadual / 6.202 interestadual)</w:t>
+      </w:r>
+    </w:p>
+    <w:p>
+      <w:r>
+        <w:t xml:space="preserve">   - Devolução de venda de clientes (entrada): _____ (Padrão: 1.202 estadual / 2.202 interestadual)</w:t>
+      </w:r>
+    </w:p>
+    <w:p>
+      <w:r>
+        <w:t>4. PIS e COFINS (Lucro Real):</w:t>
+      </w:r>
+    </w:p>
+    <w:p>
+      <w:r>
+        <w:t xml:space="preserve">   - CST de saída: _____ (Padrão: 01 - Alíquota básica)</w:t>
+      </w:r>
+    </w:p>
+    <w:p>
+      <w:r>
+        <w:t xml:space="preserve">   - Alíquota PIS: _____ % (Padrão: 1,65%)</w:t>
+      </w:r>
+    </w:p>
+    <w:p>
+      <w:r>
+        <w:t xml:space="preserve">   - Alíquota COFINS: _____ % (Padrão: 7,60%)</w:t>
+      </w:r>
+    </w:p>
+    <w:p>
+      <w:r>
+        <w:t xml:space="preserve">   - Existe algum item dessas linhas que </w:t>
+      </w:r>
+      <w:proofErr w:type="gramStart"/>
+      <w:r>
+        <w:t>seja Monofásico</w:t>
+      </w:r>
+      <w:proofErr w:type="gramEnd"/>
+      <w:r>
+        <w:t xml:space="preserve"> / Alíquota Zero (CST 04/06)?</w:t>
+      </w:r>
+    </w:p>
+    <w:p>
+      <w:r>
+        <w:t xml:space="preserve">   - Confirmar se aplicam a exclusão do ICMS da base do PIS/COFINS (Tema 69 STF).</w:t>
+      </w:r>
+    </w:p>
+    <w:p>
+      <w:r>
+        <w:t>5. IPI:</w:t>
+      </w:r>
+    </w:p>
+    <w:p>
+      <w:r>
+        <w:t xml:space="preserve">   - Como se trata de revenda comercial, confirmamos o CST 53 (Não tributado / sem destaque)?</w:t>
+      </w:r>
+    </w:p>
+    <w:p>
+      <w:r>
+        <w:lastRenderedPageBreak/>
+        <w:t xml:space="preserve">Ficamos no aguardo das orientações fiscais para deixarmos as naturezas de operação </w:t>
+      </w:r>
+      <w:proofErr w:type="spellStart"/>
+      <w:r>
+        <w:t>pré</w:t>
+      </w:r>
+      <w:proofErr w:type="spellEnd"/>
+      <w:r>
+        <w:t>-configuradas no sistema!</w:t>
+      </w:r>
+    </w:p>
+    <w:p>
+      <w:r>
+        <w:pict w14:anchorId="15D8AF4E">
+          <v:rect id="_x0000_i1055" style="width:568.05pt;height:.75pt" o:hrpct="0" o:hralign="center" o:hrstd="t" o:hr="t" fillcolor="#a0a0a0" stroked="f"/>
+        </w:pict>
+      </w:r>
+    </w:p>
+    <w:p>
+      <w:r>
+        <w:rPr>
+          <w:rFonts w:ascii="Segoe UI Emoji" w:hAnsi="Segoe UI Emoji" w:cs="Segoe UI Emoji"/>
+        </w:rPr>
+        <w:t>💡</w:t>
+      </w:r>
+      <w:r>
+        <w:t xml:space="preserve"> Como isso vai funcionar no ERP após a resposta do contador:</w:t>
+      </w:r>
+    </w:p>
+    <w:p>
+      <w:r>
+        <w:t>Você cadastrará apenas </w:t>
+      </w:r>
+      <w:r>
+        <w:rPr>
+          <w:b/>
+          <w:bCs/>
+        </w:rPr>
+        <w:t>duas Naturezas de Operação principais</w:t>
+      </w:r>
+      <w:r>
+        <w:t> para as vendas do dia a dia:</w:t>
+      </w:r>
+    </w:p>
+    <w:p>
+      <w:pPr>
+        <w:numPr>
+          <w:ilvl w:val="0"/>
+          <w:numId w:val="13"/>
+        </w:numPr>
+      </w:pPr>
+      <w:r>
+        <w:rPr>
+          <w:b/>
+          <w:bCs/>
+        </w:rPr>
+        <w:t>Venda de Mercadorias (Normal)</w:t>
+      </w:r>
+      <w:r>
+        <w:t> </w:t>
+      </w:r>
+      <w:r>
+        <w:rPr>
+          <w:rFonts w:ascii="Segoe UI Symbol" w:hAnsi="Segoe UI Symbol" w:cs="Segoe UI Symbol"/>
+        </w:rPr>
+        <w:t>➔</w:t>
+      </w:r>
+      <w:r>
+        <w:t xml:space="preserve"> CFOP</w:t>
+      </w:r>
+      <w:r>
+        <w:rPr>
+          <w:rFonts w:ascii="Aptos" w:hAnsi="Aptos" w:cs="Aptos"/>
+        </w:rPr>
+        <w:t> </w:t>
+      </w:r>
+      <w:r>
+        <w:t>5.102, CST ICMS 00, PIS 1,65%, COFINS 7,60%.</w:t>
+      </w:r>
+    </w:p>
+    <w:p>
+      <w:pPr>
+        <w:numPr>
+          <w:ilvl w:val="0"/>
+          <w:numId w:val="13"/>
+        </w:numPr>
+      </w:pPr>
+      <w:r>
+        <w:rPr>
+          <w:b/>
+          <w:bCs/>
+        </w:rPr>
+        <w:t>Venda de Mercadorias (Subst. Tributária - ST)</w:t>
+      </w:r>
+      <w:r>
+        <w:t> </w:t>
+      </w:r>
+      <w:r>
+        <w:rPr>
+          <w:rFonts w:ascii="Segoe UI Symbol" w:hAnsi="Segoe UI Symbol" w:cs="Segoe UI Symbol"/>
+        </w:rPr>
+        <w:t>➔</w:t>
+      </w:r>
+      <w:r>
+        <w:t xml:space="preserve"> CFOP</w:t>
+      </w:r>
+      <w:r>
+        <w:rPr>
+          <w:rFonts w:ascii="Aptos" w:hAnsi="Aptos" w:cs="Aptos"/>
+        </w:rPr>
+        <w:t> </w:t>
+      </w:r>
+      <w:r>
+        <w:t>5.405, CST ICMS 60, PIS 1,65%, COFINS 7,60%.</w:t>
+      </w:r>
+    </w:p>
+    <w:p>
+      <w:r>
+        <w:t>Assim, o cliente escolhe a natureza correspondente e a nota sai perfeita e homologada na SEFAZ sem nenhuma complicação!</w:t>
       </w:r>
     </w:p>
     <w:p/>
@@ -1751,6 +2464,155 @@
     </w:lvl>
   </w:abstractNum>
   <w:abstractNum w:abstractNumId="4" w15:restartNumberingAfterBreak="0">
+    <w:nsid w:val="13E73860"/>
+    <w:multiLevelType w:val="multilevel"/>
+    <w:tmpl w:val="065E8848"/>
+    <w:lvl w:ilvl="0">
+      <w:start w:val="1"/>
+      <w:numFmt w:val="bullet"/>
+      <w:lvlText w:val=""/>
+      <w:lvlJc w:val="left"/>
+      <w:pPr>
+        <w:tabs>
+          <w:tab w:val="num" w:pos="720"/>
+        </w:tabs>
+        <w:ind w:left="720" w:hanging="360"/>
+      </w:pPr>
+      <w:rPr>
+        <w:rFonts w:ascii="Symbol" w:hAnsi="Symbol" w:hint="default"/>
+        <w:sz w:val="20"/>
+      </w:rPr>
+    </w:lvl>
+    <w:lvl w:ilvl="1" w:tentative="1">
+      <w:start w:val="1"/>
+      <w:numFmt w:val="bullet"/>
+      <w:lvlText w:val=""/>
+      <w:lvlJc w:val="left"/>
+      <w:pPr>
+        <w:tabs>
+          <w:tab w:val="num" w:pos="1440"/>
+        </w:tabs>
+        <w:ind w:left="1440" w:hanging="360"/>
+      </w:pPr>
+      <w:rPr>
+        <w:rFonts w:ascii="Symbol" w:hAnsi="Symbol" w:hint="default"/>
+        <w:sz w:val="20"/>
+      </w:rPr>
+    </w:lvl>
+    <w:lvl w:ilvl="2" w:tentative="1">
+      <w:start w:val="1"/>
+      <w:numFmt w:val="bullet"/>
+      <w:lvlText w:val=""/>
+      <w:lvlJc w:val="left"/>
+      <w:pPr>
+        <w:tabs>
+          <w:tab w:val="num" w:pos="2160"/>
+        </w:tabs>
+        <w:ind w:left="2160" w:hanging="360"/>
+      </w:pPr>
+      <w:rPr>
+        <w:rFonts w:ascii="Symbol" w:hAnsi="Symbol" w:hint="default"/>
+        <w:sz w:val="20"/>
+      </w:rPr>
+    </w:lvl>
+    <w:lvl w:ilvl="3" w:tentative="1">
+      <w:start w:val="1"/>
+      <w:numFmt w:val="bullet"/>
+      <w:lvlText w:val=""/>
+      <w:lvlJc w:val="left"/>
+      <w:pPr>
+        <w:tabs>
+          <w:tab w:val="num" w:pos="2880"/>
+        </w:tabs>
+        <w:ind w:left="2880" w:hanging="360"/>
+      </w:pPr>
+      <w:rPr>
+        <w:rFonts w:ascii="Symbol" w:hAnsi="Symbol" w:hint="default"/>
+        <w:sz w:val="20"/>
+      </w:rPr>
+    </w:lvl>
+    <w:lvl w:ilvl="4" w:tentative="1">
+      <w:start w:val="1"/>
+      <w:numFmt w:val="bullet"/>
+      <w:lvlText w:val=""/>
+      <w:lvlJc w:val="left"/>
+      <w:pPr>
+        <w:tabs>
+          <w:tab w:val="num" w:pos="3600"/>
+        </w:tabs>
+        <w:ind w:left="3600" w:hanging="360"/>
+      </w:pPr>
+      <w:rPr>
+        <w:rFonts w:ascii="Symbol" w:hAnsi="Symbol" w:hint="default"/>
+        <w:sz w:val="20"/>
+      </w:rPr>
+    </w:lvl>
+    <w:lvl w:ilvl="5" w:tentative="1">
+      <w:start w:val="1"/>
+      <w:numFmt w:val="bullet"/>
+      <w:lvlText w:val=""/>
+      <w:lvlJc w:val="left"/>
+      <w:pPr>
+        <w:tabs>
+          <w:tab w:val="num" w:pos="4320"/>
+        </w:tabs>
+        <w:ind w:left="4320" w:hanging="360"/>
+      </w:pPr>
+      <w:rPr>
+        <w:rFonts w:ascii="Symbol" w:hAnsi="Symbol" w:hint="default"/>
+        <w:sz w:val="20"/>
+      </w:rPr>
+    </w:lvl>
+    <w:lvl w:ilvl="6" w:tentative="1">
+      <w:start w:val="1"/>
+      <w:numFmt w:val="bullet"/>
+      <w:lvlText w:val=""/>
+      <w:lvlJc w:val="left"/>
+      <w:pPr>
+        <w:tabs>
+          <w:tab w:val="num" w:pos="5040"/>
+        </w:tabs>
+        <w:ind w:left="5040" w:hanging="360"/>
+      </w:pPr>
+      <w:rPr>
+        <w:rFonts w:ascii="Symbol" w:hAnsi="Symbol" w:hint="default"/>
+        <w:sz w:val="20"/>
+      </w:rPr>
+    </w:lvl>
+    <w:lvl w:ilvl="7" w:tentative="1">
+      <w:start w:val="1"/>
+      <w:numFmt w:val="bullet"/>
+      <w:lvlText w:val=""/>
+      <w:lvlJc w:val="left"/>
+      <w:pPr>
+        <w:tabs>
+          <w:tab w:val="num" w:pos="5760"/>
+        </w:tabs>
+        <w:ind w:left="5760" w:hanging="360"/>
+      </w:pPr>
+      <w:rPr>
+        <w:rFonts w:ascii="Symbol" w:hAnsi="Symbol" w:hint="default"/>
+        <w:sz w:val="20"/>
+      </w:rPr>
+    </w:lvl>
+    <w:lvl w:ilvl="8" w:tentative="1">
+      <w:start w:val="1"/>
+      <w:numFmt w:val="bullet"/>
+      <w:lvlText w:val=""/>
+      <w:lvlJc w:val="left"/>
+      <w:pPr>
+        <w:tabs>
+          <w:tab w:val="num" w:pos="6480"/>
+        </w:tabs>
+        <w:ind w:left="6480" w:hanging="360"/>
+      </w:pPr>
+      <w:rPr>
+        <w:rFonts w:ascii="Symbol" w:hAnsi="Symbol" w:hint="default"/>
+        <w:sz w:val="20"/>
+      </w:rPr>
+    </w:lvl>
+  </w:abstractNum>
+  <w:abstractNum w:abstractNumId="5" w15:restartNumberingAfterBreak="0">
     <w:nsid w:val="171A0796"/>
     <w:multiLevelType w:val="multilevel"/>
     <w:tmpl w:val="59707A98"/>
@@ -1899,7 +2761,7 @@
       </w:rPr>
     </w:lvl>
   </w:abstractNum>
-  <w:abstractNum w:abstractNumId="5" w15:restartNumberingAfterBreak="0">
+  <w:abstractNum w:abstractNumId="6" w15:restartNumberingAfterBreak="0">
     <w:nsid w:val="2F43475D"/>
     <w:multiLevelType w:val="multilevel"/>
     <w:tmpl w:val="EC3C700A"/>
@@ -2048,7 +2910,156 @@
       </w:rPr>
     </w:lvl>
   </w:abstractNum>
-  <w:abstractNum w:abstractNumId="6" w15:restartNumberingAfterBreak="0">
+  <w:abstractNum w:abstractNumId="7" w15:restartNumberingAfterBreak="0">
+    <w:nsid w:val="3F5B4423"/>
+    <w:multiLevelType w:val="multilevel"/>
+    <w:tmpl w:val="55BEC428"/>
+    <w:lvl w:ilvl="0">
+      <w:start w:val="1"/>
+      <w:numFmt w:val="bullet"/>
+      <w:lvlText w:val=""/>
+      <w:lvlJc w:val="left"/>
+      <w:pPr>
+        <w:tabs>
+          <w:tab w:val="num" w:pos="720"/>
+        </w:tabs>
+        <w:ind w:left="720" w:hanging="360"/>
+      </w:pPr>
+      <w:rPr>
+        <w:rFonts w:ascii="Symbol" w:hAnsi="Symbol" w:hint="default"/>
+        <w:sz w:val="20"/>
+      </w:rPr>
+    </w:lvl>
+    <w:lvl w:ilvl="1" w:tentative="1">
+      <w:start w:val="1"/>
+      <w:numFmt w:val="bullet"/>
+      <w:lvlText w:val=""/>
+      <w:lvlJc w:val="left"/>
+      <w:pPr>
+        <w:tabs>
+          <w:tab w:val="num" w:pos="1440"/>
+        </w:tabs>
+        <w:ind w:left="1440" w:hanging="360"/>
+      </w:pPr>
+      <w:rPr>
+        <w:rFonts w:ascii="Symbol" w:hAnsi="Symbol" w:hint="default"/>
+        <w:sz w:val="20"/>
+      </w:rPr>
+    </w:lvl>
+    <w:lvl w:ilvl="2" w:tentative="1">
+      <w:start w:val="1"/>
+      <w:numFmt w:val="bullet"/>
+      <w:lvlText w:val=""/>
+      <w:lvlJc w:val="left"/>
+      <w:pPr>
+        <w:tabs>
+          <w:tab w:val="num" w:pos="2160"/>
+        </w:tabs>
+        <w:ind w:left="2160" w:hanging="360"/>
+      </w:pPr>
+      <w:rPr>
+        <w:rFonts w:ascii="Symbol" w:hAnsi="Symbol" w:hint="default"/>
+        <w:sz w:val="20"/>
+      </w:rPr>
+    </w:lvl>
+    <w:lvl w:ilvl="3" w:tentative="1">
+      <w:start w:val="1"/>
+      <w:numFmt w:val="bullet"/>
+      <w:lvlText w:val=""/>
+      <w:lvlJc w:val="left"/>
+      <w:pPr>
+        <w:tabs>
+          <w:tab w:val="num" w:pos="2880"/>
+        </w:tabs>
+        <w:ind w:left="2880" w:hanging="360"/>
+      </w:pPr>
+      <w:rPr>
+        <w:rFonts w:ascii="Symbol" w:hAnsi="Symbol" w:hint="default"/>
+        <w:sz w:val="20"/>
+      </w:rPr>
+    </w:lvl>
+    <w:lvl w:ilvl="4" w:tentative="1">
+      <w:start w:val="1"/>
+      <w:numFmt w:val="bullet"/>
+      <w:lvlText w:val=""/>
+      <w:lvlJc w:val="left"/>
+      <w:pPr>
+        <w:tabs>
+          <w:tab w:val="num" w:pos="3600"/>
+        </w:tabs>
+        <w:ind w:left="3600" w:hanging="360"/>
+      </w:pPr>
+      <w:rPr>
+        <w:rFonts w:ascii="Symbol" w:hAnsi="Symbol" w:hint="default"/>
+        <w:sz w:val="20"/>
+      </w:rPr>
+    </w:lvl>
+    <w:lvl w:ilvl="5" w:tentative="1">
+      <w:start w:val="1"/>
+      <w:numFmt w:val="bullet"/>
+      <w:lvlText w:val=""/>
+      <w:lvlJc w:val="left"/>
+      <w:pPr>
+        <w:tabs>
+          <w:tab w:val="num" w:pos="4320"/>
+        </w:tabs>
+        <w:ind w:left="4320" w:hanging="360"/>
+      </w:pPr>
+      <w:rPr>
+        <w:rFonts w:ascii="Symbol" w:hAnsi="Symbol" w:hint="default"/>
+        <w:sz w:val="20"/>
+      </w:rPr>
+    </w:lvl>
+    <w:lvl w:ilvl="6" w:tentative="1">
+      <w:start w:val="1"/>
+      <w:numFmt w:val="bullet"/>
+      <w:lvlText w:val=""/>
+      <w:lvlJc w:val="left"/>
+      <w:pPr>
+        <w:tabs>
+          <w:tab w:val="num" w:pos="5040"/>
+        </w:tabs>
+        <w:ind w:left="5040" w:hanging="360"/>
+      </w:pPr>
+      <w:rPr>
+        <w:rFonts w:ascii="Symbol" w:hAnsi="Symbol" w:hint="default"/>
+        <w:sz w:val="20"/>
+      </w:rPr>
+    </w:lvl>
+    <w:lvl w:ilvl="7" w:tentative="1">
+      <w:start w:val="1"/>
+      <w:numFmt w:val="bullet"/>
+      <w:lvlText w:val=""/>
+      <w:lvlJc w:val="left"/>
+      <w:pPr>
+        <w:tabs>
+          <w:tab w:val="num" w:pos="5760"/>
+        </w:tabs>
+        <w:ind w:left="5760" w:hanging="360"/>
+      </w:pPr>
+      <w:rPr>
+        <w:rFonts w:ascii="Symbol" w:hAnsi="Symbol" w:hint="default"/>
+        <w:sz w:val="20"/>
+      </w:rPr>
+    </w:lvl>
+    <w:lvl w:ilvl="8" w:tentative="1">
+      <w:start w:val="1"/>
+      <w:numFmt w:val="bullet"/>
+      <w:lvlText w:val=""/>
+      <w:lvlJc w:val="left"/>
+      <w:pPr>
+        <w:tabs>
+          <w:tab w:val="num" w:pos="6480"/>
+        </w:tabs>
+        <w:ind w:left="6480" w:hanging="360"/>
+      </w:pPr>
+      <w:rPr>
+        <w:rFonts w:ascii="Symbol" w:hAnsi="Symbol" w:hint="default"/>
+        <w:sz w:val="20"/>
+      </w:rPr>
+    </w:lvl>
+  </w:abstractNum>
+  <w:abstractNum w:abstractNumId="8" w15:restartNumberingAfterBreak="0">
     <w:nsid w:val="40F537BF"/>
     <w:multiLevelType w:val="multilevel"/>
     <w:tmpl w:val="A5F2E066"/>
@@ -2197,7 +3208,7 @@
       </w:rPr>
     </w:lvl>
   </w:abstractNum>
-  <w:abstractNum w:abstractNumId="7" w15:restartNumberingAfterBreak="0">
+  <w:abstractNum w:abstractNumId="9" w15:restartNumberingAfterBreak="0">
     <w:nsid w:val="4DF62A2B"/>
     <w:multiLevelType w:val="multilevel"/>
     <w:tmpl w:val="C2FE0D8C"/>
@@ -2344,6 +3355,417 @@
         <w:rFonts w:ascii="Symbol" w:hAnsi="Symbol" w:hint="default"/>
         <w:sz w:val="20"/>
       </w:rPr>
+    </w:lvl>
+  </w:abstractNum>
+  <w:abstractNum w:abstractNumId="10" w15:restartNumberingAfterBreak="0">
+    <w:nsid w:val="6FFC6110"/>
+    <w:multiLevelType w:val="multilevel"/>
+    <w:tmpl w:val="B98A681C"/>
+    <w:lvl w:ilvl="0">
+      <w:start w:val="1"/>
+      <w:numFmt w:val="bullet"/>
+      <w:lvlText w:val=""/>
+      <w:lvlJc w:val="left"/>
+      <w:pPr>
+        <w:tabs>
+          <w:tab w:val="num" w:pos="720"/>
+        </w:tabs>
+        <w:ind w:left="720" w:hanging="360"/>
+      </w:pPr>
+      <w:rPr>
+        <w:rFonts w:ascii="Symbol" w:hAnsi="Symbol" w:hint="default"/>
+        <w:sz w:val="20"/>
+      </w:rPr>
+    </w:lvl>
+    <w:lvl w:ilvl="1" w:tentative="1">
+      <w:start w:val="1"/>
+      <w:numFmt w:val="bullet"/>
+      <w:lvlText w:val=""/>
+      <w:lvlJc w:val="left"/>
+      <w:pPr>
+        <w:tabs>
+          <w:tab w:val="num" w:pos="1440"/>
+        </w:tabs>
+        <w:ind w:left="1440" w:hanging="360"/>
+      </w:pPr>
+      <w:rPr>
+        <w:rFonts w:ascii="Symbol" w:hAnsi="Symbol" w:hint="default"/>
+        <w:sz w:val="20"/>
+      </w:rPr>
+    </w:lvl>
+    <w:lvl w:ilvl="2" w:tentative="1">
+      <w:start w:val="1"/>
+      <w:numFmt w:val="bullet"/>
+      <w:lvlText w:val=""/>
+      <w:lvlJc w:val="left"/>
+      <w:pPr>
+        <w:tabs>
+          <w:tab w:val="num" w:pos="2160"/>
+        </w:tabs>
+        <w:ind w:left="2160" w:hanging="360"/>
+      </w:pPr>
+      <w:rPr>
+        <w:rFonts w:ascii="Symbol" w:hAnsi="Symbol" w:hint="default"/>
+        <w:sz w:val="20"/>
+      </w:rPr>
+    </w:lvl>
+    <w:lvl w:ilvl="3" w:tentative="1">
+      <w:start w:val="1"/>
+      <w:numFmt w:val="bullet"/>
+      <w:lvlText w:val=""/>
+      <w:lvlJc w:val="left"/>
+      <w:pPr>
+        <w:tabs>
+          <w:tab w:val="num" w:pos="2880"/>
+        </w:tabs>
+        <w:ind w:left="2880" w:hanging="360"/>
+      </w:pPr>
+      <w:rPr>
+        <w:rFonts w:ascii="Symbol" w:hAnsi="Symbol" w:hint="default"/>
+        <w:sz w:val="20"/>
+      </w:rPr>
+    </w:lvl>
+    <w:lvl w:ilvl="4" w:tentative="1">
+      <w:start w:val="1"/>
+      <w:numFmt w:val="bullet"/>
+      <w:lvlText w:val=""/>
+      <w:lvlJc w:val="left"/>
+      <w:pPr>
+        <w:tabs>
+          <w:tab w:val="num" w:pos="3600"/>
+        </w:tabs>
+        <w:ind w:left="3600" w:hanging="360"/>
+      </w:pPr>
+      <w:rPr>
+        <w:rFonts w:ascii="Symbol" w:hAnsi="Symbol" w:hint="default"/>
+        <w:sz w:val="20"/>
+      </w:rPr>
+    </w:lvl>
+    <w:lvl w:ilvl="5" w:tentative="1">
+      <w:start w:val="1"/>
+      <w:numFmt w:val="bullet"/>
+      <w:lvlText w:val=""/>
+      <w:lvlJc w:val="left"/>
+      <w:pPr>
+        <w:tabs>
+          <w:tab w:val="num" w:pos="4320"/>
+        </w:tabs>
+        <w:ind w:left="4320" w:hanging="360"/>
+      </w:pPr>
+      <w:rPr>
+        <w:rFonts w:ascii="Symbol" w:hAnsi="Symbol" w:hint="default"/>
+        <w:sz w:val="20"/>
+      </w:rPr>
+    </w:lvl>
+    <w:lvl w:ilvl="6" w:tentative="1">
+      <w:start w:val="1"/>
+      <w:numFmt w:val="bullet"/>
+      <w:lvlText w:val=""/>
+      <w:lvlJc w:val="left"/>
+      <w:pPr>
+        <w:tabs>
+          <w:tab w:val="num" w:pos="5040"/>
+        </w:tabs>
+        <w:ind w:left="5040" w:hanging="360"/>
+      </w:pPr>
+      <w:rPr>
+        <w:rFonts w:ascii="Symbol" w:hAnsi="Symbol" w:hint="default"/>
+        <w:sz w:val="20"/>
+      </w:rPr>
+    </w:lvl>
+    <w:lvl w:ilvl="7" w:tentative="1">
+      <w:start w:val="1"/>
+      <w:numFmt w:val="bullet"/>
+      <w:lvlText w:val=""/>
+      <w:lvlJc w:val="left"/>
+      <w:pPr>
+        <w:tabs>
+          <w:tab w:val="num" w:pos="5760"/>
+        </w:tabs>
+        <w:ind w:left="5760" w:hanging="360"/>
+      </w:pPr>
+      <w:rPr>
+        <w:rFonts w:ascii="Symbol" w:hAnsi="Symbol" w:hint="default"/>
+        <w:sz w:val="20"/>
+      </w:rPr>
+    </w:lvl>
+    <w:lvl w:ilvl="8" w:tentative="1">
+      <w:start w:val="1"/>
+      <w:numFmt w:val="bullet"/>
+      <w:lvlText w:val=""/>
+      <w:lvlJc w:val="left"/>
+      <w:pPr>
+        <w:tabs>
+          <w:tab w:val="num" w:pos="6480"/>
+        </w:tabs>
+        <w:ind w:left="6480" w:hanging="360"/>
+      </w:pPr>
+      <w:rPr>
+        <w:rFonts w:ascii="Symbol" w:hAnsi="Symbol" w:hint="default"/>
+        <w:sz w:val="20"/>
+      </w:rPr>
+    </w:lvl>
+  </w:abstractNum>
+  <w:abstractNum w:abstractNumId="11" w15:restartNumberingAfterBreak="0">
+    <w:nsid w:val="78413A52"/>
+    <w:multiLevelType w:val="multilevel"/>
+    <w:tmpl w:val="1AEAF0F0"/>
+    <w:lvl w:ilvl="0">
+      <w:start w:val="1"/>
+      <w:numFmt w:val="bullet"/>
+      <w:lvlText w:val=""/>
+      <w:lvlJc w:val="left"/>
+      <w:pPr>
+        <w:tabs>
+          <w:tab w:val="num" w:pos="720"/>
+        </w:tabs>
+        <w:ind w:left="720" w:hanging="360"/>
+      </w:pPr>
+      <w:rPr>
+        <w:rFonts w:ascii="Symbol" w:hAnsi="Symbol" w:hint="default"/>
+        <w:sz w:val="20"/>
+      </w:rPr>
+    </w:lvl>
+    <w:lvl w:ilvl="1" w:tentative="1">
+      <w:start w:val="1"/>
+      <w:numFmt w:val="bullet"/>
+      <w:lvlText w:val=""/>
+      <w:lvlJc w:val="left"/>
+      <w:pPr>
+        <w:tabs>
+          <w:tab w:val="num" w:pos="1440"/>
+        </w:tabs>
+        <w:ind w:left="1440" w:hanging="360"/>
+      </w:pPr>
+      <w:rPr>
+        <w:rFonts w:ascii="Symbol" w:hAnsi="Symbol" w:hint="default"/>
+        <w:sz w:val="20"/>
+      </w:rPr>
+    </w:lvl>
+    <w:lvl w:ilvl="2" w:tentative="1">
+      <w:start w:val="1"/>
+      <w:numFmt w:val="bullet"/>
+      <w:lvlText w:val=""/>
+      <w:lvlJc w:val="left"/>
+      <w:pPr>
+        <w:tabs>
+          <w:tab w:val="num" w:pos="2160"/>
+        </w:tabs>
+        <w:ind w:left="2160" w:hanging="360"/>
+      </w:pPr>
+      <w:rPr>
+        <w:rFonts w:ascii="Symbol" w:hAnsi="Symbol" w:hint="default"/>
+        <w:sz w:val="20"/>
+      </w:rPr>
+    </w:lvl>
+    <w:lvl w:ilvl="3" w:tentative="1">
+      <w:start w:val="1"/>
+      <w:numFmt w:val="bullet"/>
+      <w:lvlText w:val=""/>
+      <w:lvlJc w:val="left"/>
+      <w:pPr>
+        <w:tabs>
+          <w:tab w:val="num" w:pos="2880"/>
+        </w:tabs>
+        <w:ind w:left="2880" w:hanging="360"/>
+      </w:pPr>
+      <w:rPr>
+        <w:rFonts w:ascii="Symbol" w:hAnsi="Symbol" w:hint="default"/>
+        <w:sz w:val="20"/>
+      </w:rPr>
+    </w:lvl>
+    <w:lvl w:ilvl="4" w:tentative="1">
+      <w:start w:val="1"/>
+      <w:numFmt w:val="bullet"/>
+      <w:lvlText w:val=""/>
+      <w:lvlJc w:val="left"/>
+      <w:pPr>
+        <w:tabs>
+          <w:tab w:val="num" w:pos="3600"/>
+        </w:tabs>
+        <w:ind w:left="3600" w:hanging="360"/>
+      </w:pPr>
+      <w:rPr>
+        <w:rFonts w:ascii="Symbol" w:hAnsi="Symbol" w:hint="default"/>
+        <w:sz w:val="20"/>
+      </w:rPr>
+    </w:lvl>
+    <w:lvl w:ilvl="5" w:tentative="1">
+      <w:start w:val="1"/>
+      <w:numFmt w:val="bullet"/>
+      <w:lvlText w:val=""/>
+      <w:lvlJc w:val="left"/>
+      <w:pPr>
+        <w:tabs>
+          <w:tab w:val="num" w:pos="4320"/>
+        </w:tabs>
+        <w:ind w:left="4320" w:hanging="360"/>
+      </w:pPr>
+      <w:rPr>
+        <w:rFonts w:ascii="Symbol" w:hAnsi="Symbol" w:hint="default"/>
+        <w:sz w:val="20"/>
+      </w:rPr>
+    </w:lvl>
+    <w:lvl w:ilvl="6" w:tentative="1">
+      <w:start w:val="1"/>
+      <w:numFmt w:val="bullet"/>
+      <w:lvlText w:val=""/>
+      <w:lvlJc w:val="left"/>
+      <w:pPr>
+        <w:tabs>
+          <w:tab w:val="num" w:pos="5040"/>
+        </w:tabs>
+        <w:ind w:left="5040" w:hanging="360"/>
+      </w:pPr>
+      <w:rPr>
+        <w:rFonts w:ascii="Symbol" w:hAnsi="Symbol" w:hint="default"/>
+        <w:sz w:val="20"/>
+      </w:rPr>
+    </w:lvl>
+    <w:lvl w:ilvl="7" w:tentative="1">
+      <w:start w:val="1"/>
+      <w:numFmt w:val="bullet"/>
+      <w:lvlText w:val=""/>
+      <w:lvlJc w:val="left"/>
+      <w:pPr>
+        <w:tabs>
+          <w:tab w:val="num" w:pos="5760"/>
+        </w:tabs>
+        <w:ind w:left="5760" w:hanging="360"/>
+      </w:pPr>
+      <w:rPr>
+        <w:rFonts w:ascii="Symbol" w:hAnsi="Symbol" w:hint="default"/>
+        <w:sz w:val="20"/>
+      </w:rPr>
+    </w:lvl>
+    <w:lvl w:ilvl="8" w:tentative="1">
+      <w:start w:val="1"/>
+      <w:numFmt w:val="bullet"/>
+      <w:lvlText w:val=""/>
+      <w:lvlJc w:val="left"/>
+      <w:pPr>
+        <w:tabs>
+          <w:tab w:val="num" w:pos="6480"/>
+        </w:tabs>
+        <w:ind w:left="6480" w:hanging="360"/>
+      </w:pPr>
+      <w:rPr>
+        <w:rFonts w:ascii="Symbol" w:hAnsi="Symbol" w:hint="default"/>
+        <w:sz w:val="20"/>
+      </w:rPr>
+    </w:lvl>
+  </w:abstractNum>
+  <w:abstractNum w:abstractNumId="12" w15:restartNumberingAfterBreak="0">
+    <w:nsid w:val="79E22C57"/>
+    <w:multiLevelType w:val="multilevel"/>
+    <w:tmpl w:val="77EC282C"/>
+    <w:lvl w:ilvl="0">
+      <w:start w:val="1"/>
+      <w:numFmt w:val="decimal"/>
+      <w:lvlText w:val="%1."/>
+      <w:lvlJc w:val="left"/>
+      <w:pPr>
+        <w:tabs>
+          <w:tab w:val="num" w:pos="720"/>
+        </w:tabs>
+        <w:ind w:left="720" w:hanging="360"/>
+      </w:pPr>
+    </w:lvl>
+    <w:lvl w:ilvl="1" w:tentative="1">
+      <w:start w:val="1"/>
+      <w:numFmt w:val="decimal"/>
+      <w:lvlText w:val="%2."/>
+      <w:lvlJc w:val="left"/>
+      <w:pPr>
+        <w:tabs>
+          <w:tab w:val="num" w:pos="1440"/>
+        </w:tabs>
+        <w:ind w:left="1440" w:hanging="360"/>
+      </w:pPr>
+    </w:lvl>
+    <w:lvl w:ilvl="2" w:tentative="1">
+      <w:start w:val="1"/>
+      <w:numFmt w:val="decimal"/>
+      <w:lvlText w:val="%3."/>
+      <w:lvlJc w:val="left"/>
+      <w:pPr>
+        <w:tabs>
+          <w:tab w:val="num" w:pos="2160"/>
+        </w:tabs>
+        <w:ind w:left="2160" w:hanging="360"/>
+      </w:pPr>
+    </w:lvl>
+    <w:lvl w:ilvl="3" w:tentative="1">
+      <w:start w:val="1"/>
+      <w:numFmt w:val="decimal"/>
+      <w:lvlText w:val="%4."/>
+      <w:lvlJc w:val="left"/>
+      <w:pPr>
+        <w:tabs>
+          <w:tab w:val="num" w:pos="2880"/>
+        </w:tabs>
+        <w:ind w:left="2880" w:hanging="360"/>
+      </w:pPr>
+    </w:lvl>
+    <w:lvl w:ilvl="4" w:tentative="1">
+      <w:start w:val="1"/>
+      <w:numFmt w:val="decimal"/>
+      <w:lvlText w:val="%5."/>
+      <w:lvlJc w:val="left"/>
+      <w:pPr>
+        <w:tabs>
+          <w:tab w:val="num" w:pos="3600"/>
+        </w:tabs>
+        <w:ind w:left="3600" w:hanging="360"/>
+      </w:pPr>
+    </w:lvl>
+    <w:lvl w:ilvl="5" w:tentative="1">
+      <w:start w:val="1"/>
+      <w:numFmt w:val="decimal"/>
+      <w:lvlText w:val="%6."/>
+      <w:lvlJc w:val="left"/>
+      <w:pPr>
+        <w:tabs>
+          <w:tab w:val="num" w:pos="4320"/>
+        </w:tabs>
+        <w:ind w:left="4320" w:hanging="360"/>
+      </w:pPr>
+    </w:lvl>
+    <w:lvl w:ilvl="6" w:tentative="1">
+      <w:start w:val="1"/>
+      <w:numFmt w:val="decimal"/>
+      <w:lvlText w:val="%7."/>
+      <w:lvlJc w:val="left"/>
+      <w:pPr>
+        <w:tabs>
+          <w:tab w:val="num" w:pos="5040"/>
+        </w:tabs>
+        <w:ind w:left="5040" w:hanging="360"/>
+      </w:pPr>
+    </w:lvl>
+    <w:lvl w:ilvl="7" w:tentative="1">
+      <w:start w:val="1"/>
+      <w:numFmt w:val="decimal"/>
+      <w:lvlText w:val="%8."/>
+      <w:lvlJc w:val="left"/>
+      <w:pPr>
+        <w:tabs>
+          <w:tab w:val="num" w:pos="5760"/>
+        </w:tabs>
+        <w:ind w:left="5760" w:hanging="360"/>
+      </w:pPr>
+    </w:lvl>
+    <w:lvl w:ilvl="8" w:tentative="1">
+      <w:start w:val="1"/>
+      <w:numFmt w:val="decimal"/>
+      <w:lvlText w:val="%9."/>
+      <w:lvlJc w:val="left"/>
+      <w:pPr>
+        <w:tabs>
+          <w:tab w:val="num" w:pos="6480"/>
+        </w:tabs>
+        <w:ind w:left="6480" w:hanging="360"/>
+      </w:pPr>
     </w:lvl>
   </w:abstractNum>
   <w:num w:numId="1" w16cid:durableId="460925090">
@@ -2353,22 +3775,37 @@
     <w:abstractNumId w:val="3"/>
   </w:num>
   <w:num w:numId="3" w16cid:durableId="1484005679">
-    <w:abstractNumId w:val="5"/>
+    <w:abstractNumId w:val="6"/>
   </w:num>
   <w:num w:numId="4" w16cid:durableId="510680789">
-    <w:abstractNumId w:val="6"/>
+    <w:abstractNumId w:val="8"/>
   </w:num>
   <w:num w:numId="5" w16cid:durableId="92095432">
-    <w:abstractNumId w:val="7"/>
+    <w:abstractNumId w:val="9"/>
   </w:num>
   <w:num w:numId="6" w16cid:durableId="1429542242">
-    <w:abstractNumId w:val="4"/>
+    <w:abstractNumId w:val="5"/>
   </w:num>
   <w:num w:numId="7" w16cid:durableId="1065446036">
     <w:abstractNumId w:val="1"/>
   </w:num>
   <w:num w:numId="8" w16cid:durableId="2015718183">
     <w:abstractNumId w:val="0"/>
+  </w:num>
+  <w:num w:numId="9" w16cid:durableId="1875993530">
+    <w:abstractNumId w:val="7"/>
+  </w:num>
+  <w:num w:numId="10" w16cid:durableId="1302806331">
+    <w:abstractNumId w:val="4"/>
+  </w:num>
+  <w:num w:numId="11" w16cid:durableId="1969236186">
+    <w:abstractNumId w:val="11"/>
+  </w:num>
+  <w:num w:numId="12" w16cid:durableId="1218083288">
+    <w:abstractNumId w:val="10"/>
+  </w:num>
+  <w:num w:numId="13" w16cid:durableId="976883691">
+    <w:abstractNumId w:val="12"/>
   </w:num>
 </w:numbering>
 </file>

</xml_diff>